<commit_message>
Update Documentación Proyecto Unidad 2.docx
</commit_message>
<xml_diff>
--- a/docs/licitacion/Documentación Proyecto Unidad 2.docx
+++ b/docs/licitacion/Documentación Proyecto Unidad 2.docx
@@ -3,23 +3,134 @@
 <w:document xmlns:wpc="http://schemas.microsoft.com/office/word/2010/wordprocessingCanvas" xmlns:cx="http://schemas.microsoft.com/office/drawing/2014/chartex" xmlns:cx1="http://schemas.microsoft.com/office/drawing/2015/9/8/chartex" xmlns:cx2="http://schemas.microsoft.com/office/drawing/2015/10/21/chartex" xmlns:cx3="http://schemas.microsoft.com/office/drawing/2016/5/9/chartex" xmlns:cx4="http://schemas.microsoft.com/office/drawing/2016/5/10/chartex" xmlns:cx5="http://schemas.microsoft.com/office/drawing/2016/5/11/chartex" xmlns:cx6="http://schemas.microsoft.com/office/drawing/2016/5/12/chartex" xmlns:cx7="http://schemas.microsoft.com/office/drawing/2016/5/13/chartex" xmlns:cx8="http://schemas.microsoft.com/office/drawing/2016/5/14/chartex" xmlns:mc="http://schemas.openxmlformats.org/markup-compatibility/2006" xmlns:aink="http://schemas.microsoft.com/office/drawing/2016/ink" xmlns:am3d="http://schemas.microsoft.com/office/drawing/2017/model3d" xmlns:o="urn:schemas-microsoft-com:office:office" xmlns:oel="http://schemas.microsoft.com/office/2019/extlst" xmlns:r="http://schemas.openxmlformats.org/officeDocument/2006/relationships" xmlns:m="http://schemas.openxmlformats.org/officeDocument/2006/math" xmlns:v="urn:schemas-microsoft-com:vml" xmlns:wp14="http://schemas.microsoft.com/office/word/2010/wordprocessingDrawing" xmlns:wp="http://schemas.openxmlformats.org/drawingml/2006/wordprocessingDrawing" xmlns:w10="urn:schemas-microsoft-com:office:word" xmlns:w="http://schemas.openxmlformats.org/wordprocessingml/2006/main" xmlns:w14="http://schemas.microsoft.com/office/word/2010/wordml" xmlns:w15="http://schemas.microsoft.com/office/word/2012/wordml" xmlns:w16cex="http://schemas.microsoft.com/office/word/2018/wordml/cex" xmlns:w16cid="http://schemas.microsoft.com/office/word/2016/wordml/cid" xmlns:w16="http://schemas.microsoft.com/office/word/2018/wordml" xmlns:w16du="http://schemas.microsoft.com/office/word/2023/wordml/word16du" xmlns:w16sdtdh="http://schemas.microsoft.com/office/word/2020/wordml/sdtdatahash" xmlns:w16sdtfl="http://schemas.microsoft.com/office/word/2024/wordml/sdtformatlock" xmlns:w16se="http://schemas.microsoft.com/office/word/2015/wordml/symex" xmlns:wpg="http://schemas.microsoft.com/office/word/2010/wordprocessingGroup" xmlns:wpi="http://schemas.microsoft.com/office/word/2010/wordprocessingInk" xmlns:wne="http://schemas.microsoft.com/office/word/2006/wordml" xmlns:wps="http://schemas.microsoft.com/office/word/2010/wordprocessingShape" mc:Ignorable="w14 w15 w16se w16cid w16 w16cex w16sdtdh w16sdtfl w16du wp14">
   <w:body>
     <w:p>
-      <w:r>
+      <w:pPr>
+        <w:jc w:val="center"/>
+        <w:rPr>
+          <w:sz w:val="36"/>
+          <w:szCs w:val="36"/>
+        </w:rPr>
+      </w:pPr>
+    </w:p>
+    <w:p>
+      <w:pPr>
+        <w:jc w:val="center"/>
+        <w:rPr>
+          <w:sz w:val="36"/>
+          <w:szCs w:val="36"/>
+        </w:rPr>
+      </w:pPr>
+    </w:p>
+    <w:p>
+      <w:pPr>
+        <w:jc w:val="center"/>
+        <w:rPr>
+          <w:sz w:val="36"/>
+          <w:szCs w:val="36"/>
+        </w:rPr>
+      </w:pPr>
+    </w:p>
+    <w:p>
+      <w:pPr>
+        <w:jc w:val="center"/>
+        <w:rPr>
+          <w:sz w:val="36"/>
+          <w:szCs w:val="36"/>
+        </w:rPr>
+      </w:pPr>
+    </w:p>
+    <w:p>
+      <w:pPr>
+        <w:jc w:val="center"/>
+        <w:rPr>
+          <w:sz w:val="36"/>
+          <w:szCs w:val="36"/>
+        </w:rPr>
+      </w:pPr>
+    </w:p>
+    <w:p>
+      <w:pPr>
+        <w:jc w:val="center"/>
+        <w:rPr>
+          <w:sz w:val="36"/>
+          <w:szCs w:val="36"/>
+        </w:rPr>
+      </w:pPr>
+    </w:p>
+    <w:p>
+      <w:pPr>
+        <w:jc w:val="center"/>
+        <w:rPr>
+          <w:sz w:val="36"/>
+          <w:szCs w:val="36"/>
+        </w:rPr>
+      </w:pPr>
+    </w:p>
+    <w:p>
+      <w:pPr>
+        <w:jc w:val="center"/>
+        <w:rPr>
+          <w:sz w:val="36"/>
+          <w:szCs w:val="36"/>
+        </w:rPr>
+      </w:pPr>
+    </w:p>
+    <w:p>
+      <w:pPr>
+        <w:jc w:val="center"/>
+        <w:rPr>
+          <w:sz w:val="36"/>
+          <w:szCs w:val="36"/>
+        </w:rPr>
+      </w:pPr>
+    </w:p>
+    <w:p>
+      <w:pPr>
+        <w:jc w:val="center"/>
+        <w:rPr>
+          <w:sz w:val="36"/>
+          <w:szCs w:val="36"/>
+        </w:rPr>
+      </w:pPr>
+      <w:r>
+        <w:rPr>
+          <w:sz w:val="36"/>
+          <w:szCs w:val="36"/>
+        </w:rPr>
         <w:t>Documentación Proyecto Unidad 2</w:t>
       </w:r>
     </w:p>
-    <w:p/>
-    <w:p/>
-    <w:p/>
-    <w:p/>
-    <w:p/>
-    <w:p/>
-    <w:p/>
-    <w:p/>
-    <w:p/>
-    <w:p/>
-    <w:p/>
-    <w:p/>
-    <w:p/>
+    <w:p>
+      <w:pPr>
+        <w:jc w:val="center"/>
+        <w:rPr>
+          <w:sz w:val="36"/>
+          <w:szCs w:val="36"/>
+        </w:rPr>
+      </w:pPr>
+      <w:r>
+        <w:rPr>
+          <w:sz w:val="36"/>
+          <w:szCs w:val="36"/>
+        </w:rPr>
+        <w:t xml:space="preserve">Sistema Clínico, licitación </w:t>
+      </w:r>
+      <w:proofErr w:type="spellStart"/>
+      <w:r>
+        <w:rPr>
+          <w:sz w:val="36"/>
+          <w:szCs w:val="36"/>
+        </w:rPr>
+        <w:t>Cesfam</w:t>
+      </w:r>
+      <w:proofErr w:type="spellEnd"/>
+      <w:r>
+        <w:rPr>
+          <w:sz w:val="36"/>
+          <w:szCs w:val="36"/>
+        </w:rPr>
+        <w:t xml:space="preserve"> Villa Alemana</w:t>
+      </w:r>
+    </w:p>
     <w:p/>
     <w:p/>
     <w:p/>
@@ -38,7 +149,6 @@
     <w:p/>
     <w:p>
       <w:r>
-        <w:lastRenderedPageBreak/>
         <w:t>Licitación y problema abordado</w:t>
       </w:r>
     </w:p>
@@ -119,17 +229,1100 @@
         <w:t>.</w:t>
       </w:r>
     </w:p>
-    <w:p/>
-    <w:p>
-      <w:r>
-        <w:t>Capas Lógicas</w:t>
-      </w:r>
-    </w:p>
-    <w:p/>
-    <w:p>
-      <w:r>
-        <w:t>Rayen_gateway</w:t>
-      </w:r>
+    <w:p>
+      <w:r>
+        <w:br w:type="page"/>
+      </w:r>
+    </w:p>
+    <w:p>
+      <w:proofErr w:type="spellStart"/>
+      <w:r>
+        <w:lastRenderedPageBreak/>
+        <w:t>Frontend</w:t>
+      </w:r>
+      <w:proofErr w:type="spellEnd"/>
+      <w:r>
+        <w:t xml:space="preserve">: contenedor </w:t>
+      </w:r>
+      <w:proofErr w:type="spellStart"/>
+      <w:r>
+        <w:t>aisñaado</w:t>
+      </w:r>
+      <w:proofErr w:type="spellEnd"/>
+      <w:r>
+        <w:t xml:space="preserve"> en la red interna. No expone puertos al host, el tráfico entrante es otorgado por el </w:t>
+      </w:r>
+      <w:proofErr w:type="spellStart"/>
+      <w:r>
+        <w:t>gateway</w:t>
+      </w:r>
+      <w:proofErr w:type="spellEnd"/>
+    </w:p>
+    <w:p/>
+    <w:p>
+      <w:proofErr w:type="spellStart"/>
+      <w:r>
+        <w:t>Backend</w:t>
+      </w:r>
+      <w:proofErr w:type="spellEnd"/>
+      <w:r>
+        <w:t xml:space="preserve">: contenedor </w:t>
+      </w:r>
+      <w:r>
+        <w:t>crítico del</w:t>
+      </w:r>
+      <w:r>
+        <w:t xml:space="preserve"> sistema, </w:t>
+      </w:r>
+      <w:r>
+        <w:t>procesa</w:t>
+      </w:r>
+      <w:r>
+        <w:t xml:space="preserve"> las solicitudes transaccionales. Opera </w:t>
+      </w:r>
+      <w:r>
+        <w:t>en</w:t>
+      </w:r>
+      <w:r>
+        <w:t xml:space="preserve"> un entorno aislado y se para </w:t>
+      </w:r>
+      <w:proofErr w:type="spellStart"/>
+      <w:r>
+        <w:t>metriza</w:t>
+      </w:r>
+      <w:proofErr w:type="spellEnd"/>
+      <w:r>
+        <w:t xml:space="preserve"> dinámicamente mediante el consumo </w:t>
+      </w:r>
+      <w:proofErr w:type="spellStart"/>
+      <w:r>
+        <w:t>de el</w:t>
+      </w:r>
+      <w:proofErr w:type="spellEnd"/>
+      <w:r>
+        <w:t xml:space="preserve"> archivo de las variables de </w:t>
+      </w:r>
+      <w:proofErr w:type="gramStart"/>
+      <w:r>
+        <w:t>entorno .</w:t>
+      </w:r>
+      <w:proofErr w:type="spellStart"/>
+      <w:r>
+        <w:t>env</w:t>
+      </w:r>
+      <w:proofErr w:type="spellEnd"/>
+      <w:proofErr w:type="gramEnd"/>
+    </w:p>
+    <w:p/>
+    <w:p>
+      <w:pPr>
+        <w:jc w:val="center"/>
+        <w:rPr>
+          <w:sz w:val="28"/>
+          <w:szCs w:val="28"/>
+        </w:rPr>
+      </w:pPr>
+      <w:r>
+        <w:rPr>
+          <w:sz w:val="28"/>
+          <w:szCs w:val="28"/>
+        </w:rPr>
+        <w:t>Monitoreo</w:t>
+      </w:r>
+    </w:p>
+    <w:p>
+      <w:proofErr w:type="spellStart"/>
+      <w:r>
+        <w:t>Cadvisor</w:t>
+      </w:r>
+      <w:proofErr w:type="spellEnd"/>
+      <w:r>
+        <w:t xml:space="preserve">, requiere un nivel de ejecución elevado, debido a que monta directorios clave </w:t>
+      </w:r>
+      <w:r>
+        <w:t>del</w:t>
+      </w:r>
+      <w:r>
+        <w:t xml:space="preserve"> sistema </w:t>
+      </w:r>
+      <w:r>
+        <w:t>de</w:t>
+      </w:r>
+      <w:r>
+        <w:t xml:space="preserve"> archivos del host. Analiza a nivel de </w:t>
+      </w:r>
+      <w:proofErr w:type="spellStart"/>
+      <w:r>
+        <w:t>kernel</w:t>
+      </w:r>
+      <w:proofErr w:type="spellEnd"/>
+      <w:r>
+        <w:t xml:space="preserve"> el consumo de la CPU, memoria, red y disco de todos los contenedores en tiempo de ejecución.</w:t>
+      </w:r>
+    </w:p>
+    <w:p/>
+    <w:p>
+      <w:r>
+        <w:t xml:space="preserve">Prometheus: consume las métricas </w:t>
+      </w:r>
+      <w:r>
+        <w:t>recolectadas</w:t>
+      </w:r>
+      <w:r>
+        <w:t xml:space="preserve"> por el </w:t>
+      </w:r>
+      <w:proofErr w:type="spellStart"/>
+      <w:r>
+        <w:t>cadvisor</w:t>
+      </w:r>
+      <w:proofErr w:type="spellEnd"/>
+      <w:r>
+        <w:t xml:space="preserve"> a través de la red privada de manera cíclica. Utilizando configuraciones estáticas declaradas en </w:t>
+      </w:r>
+      <w:proofErr w:type="spellStart"/>
+      <w:r>
+        <w:t>au</w:t>
+      </w:r>
+      <w:proofErr w:type="spellEnd"/>
+      <w:r>
+        <w:t xml:space="preserve"> archivo.</w:t>
+      </w:r>
+    </w:p>
+    <w:p/>
+    <w:p>
+      <w:proofErr w:type="spellStart"/>
+      <w:r>
+        <w:t>Grafana</w:t>
+      </w:r>
+      <w:proofErr w:type="spellEnd"/>
+      <w:r>
+        <w:t xml:space="preserve">: actúa como la interfaz </w:t>
+      </w:r>
+      <w:r>
+        <w:t>de</w:t>
+      </w:r>
+      <w:r>
+        <w:t xml:space="preserve"> </w:t>
+      </w:r>
+      <w:r>
+        <w:t>visualización</w:t>
+      </w:r>
+      <w:r>
+        <w:t xml:space="preserve">. A el </w:t>
+      </w:r>
+      <w:r>
+        <w:t>tráfico</w:t>
+      </w:r>
+      <w:r>
+        <w:t xml:space="preserve"> se administra a </w:t>
+      </w:r>
+      <w:r>
+        <w:t>través</w:t>
+      </w:r>
+      <w:r>
+        <w:t xml:space="preserve"> </w:t>
+      </w:r>
+      <w:proofErr w:type="gramStart"/>
+      <w:r>
+        <w:t>del .</w:t>
+      </w:r>
+      <w:proofErr w:type="spellStart"/>
+      <w:r>
+        <w:t>env</w:t>
+      </w:r>
+      <w:proofErr w:type="spellEnd"/>
+      <w:proofErr w:type="gramEnd"/>
+      <w:r>
+        <w:t xml:space="preserve">. permitiendo que el contenedor sirva los </w:t>
+      </w:r>
+      <w:r>
+        <w:t>paneles</w:t>
+      </w:r>
+      <w:r>
+        <w:t xml:space="preserve"> a través de una </w:t>
+      </w:r>
+      <w:proofErr w:type="spellStart"/>
+      <w:r>
+        <w:t>sub-ruta</w:t>
+      </w:r>
+      <w:proofErr w:type="spellEnd"/>
+      <w:r>
+        <w:t xml:space="preserve"> del </w:t>
+      </w:r>
+      <w:proofErr w:type="spellStart"/>
+      <w:r>
+        <w:t>gateway</w:t>
+      </w:r>
+      <w:proofErr w:type="spellEnd"/>
+      <w:r>
+        <w:t xml:space="preserve"> público, manteniendo la cohesión </w:t>
+      </w:r>
+      <w:r>
+        <w:t>de</w:t>
+      </w:r>
+      <w:r>
+        <w:t xml:space="preserve"> acceso</w:t>
+      </w:r>
+    </w:p>
+    <w:p/>
+    <w:p>
+      <w:pPr>
+        <w:jc w:val="center"/>
+        <w:rPr>
+          <w:sz w:val="28"/>
+          <w:szCs w:val="28"/>
+        </w:rPr>
+      </w:pPr>
+      <w:r>
+        <w:rPr>
+          <w:sz w:val="28"/>
+          <w:szCs w:val="28"/>
+        </w:rPr>
+        <w:t>Inteligencia artificial y su aplicación</w:t>
+      </w:r>
+    </w:p>
+    <w:p>
+      <w:r>
+        <w:t xml:space="preserve">Se optó por utilizar </w:t>
+      </w:r>
+      <w:proofErr w:type="spellStart"/>
+      <w:r>
+        <w:t>ollama</w:t>
+      </w:r>
+      <w:proofErr w:type="spellEnd"/>
+      <w:r>
+        <w:t xml:space="preserve"> como inteligencia artificial, la cual, utiliza llama3 como lenguaje, se aplicó esta inteligencia artificial en un </w:t>
+      </w:r>
+      <w:proofErr w:type="spellStart"/>
+      <w:r>
+        <w:t>chatbot</w:t>
+      </w:r>
+      <w:proofErr w:type="spellEnd"/>
+      <w:r>
+        <w:t>, este responde consultas y recomienda acciones que tomar dentro de la página.</w:t>
+      </w:r>
+    </w:p>
+    <w:p/>
+    <w:p>
+      <w:r>
+        <w:t xml:space="preserve">Se </w:t>
+      </w:r>
+      <w:r>
+        <w:t>instala</w:t>
+      </w:r>
+      <w:r>
+        <w:t xml:space="preserve"> mediante el contenedor de </w:t>
+      </w:r>
+      <w:proofErr w:type="spellStart"/>
+      <w:r>
+        <w:t>ollama_init</w:t>
+      </w:r>
+      <w:proofErr w:type="spellEnd"/>
+      <w:r>
+        <w:t xml:space="preserve">, el cual descarga la versión de </w:t>
+      </w:r>
+      <w:proofErr w:type="spellStart"/>
+      <w:r>
+        <w:t>ollama</w:t>
+      </w:r>
+      <w:proofErr w:type="spellEnd"/>
+      <w:r>
+        <w:t xml:space="preserve"> 0.30.8.</w:t>
+      </w:r>
+    </w:p>
+    <w:p>
+      <w:r>
+        <w:t xml:space="preserve">La </w:t>
+      </w:r>
+      <w:r>
+        <w:t>ejecución</w:t>
+      </w:r>
+      <w:r>
+        <w:t xml:space="preserve"> de </w:t>
+      </w:r>
+      <w:proofErr w:type="spellStart"/>
+      <w:r>
+        <w:t>ollama</w:t>
+      </w:r>
+      <w:proofErr w:type="spellEnd"/>
+      <w:r>
+        <w:t xml:space="preserve"> está completamente radicada en el contenedor chat-</w:t>
+      </w:r>
+      <w:proofErr w:type="spellStart"/>
+      <w:r>
+        <w:t>ia</w:t>
+      </w:r>
+      <w:proofErr w:type="spellEnd"/>
+      <w:r>
+        <w:t>, este encapsula la lógica de interacción, para que el cliente final pueda utilizar la IA.</w:t>
+      </w:r>
+    </w:p>
+    <w:p/>
+    <w:p>
+      <w:pPr>
+        <w:jc w:val="center"/>
+        <w:rPr>
+          <w:sz w:val="28"/>
+          <w:szCs w:val="28"/>
+        </w:rPr>
+      </w:pPr>
+      <w:r>
+        <w:rPr>
+          <w:sz w:val="28"/>
+          <w:szCs w:val="28"/>
+        </w:rPr>
+        <w:lastRenderedPageBreak/>
+        <w:t>Dependencias</w:t>
+      </w:r>
+    </w:p>
+    <w:p/>
+    <w:p>
+      <w:r>
+        <w:t xml:space="preserve">El </w:t>
+      </w:r>
+      <w:r>
+        <w:t>diseño</w:t>
+      </w:r>
+      <w:r>
+        <w:t xml:space="preserve"> de la arquitectura garantiza la tolerancia a fallos y la consistencia en el orden de arranque a </w:t>
+      </w:r>
+      <w:r>
+        <w:t>través</w:t>
+      </w:r>
+      <w:r>
+        <w:t xml:space="preserve"> de dos </w:t>
+      </w:r>
+      <w:r>
+        <w:t>mecanismos</w:t>
+      </w:r>
+      <w:r>
+        <w:t xml:space="preserve"> nativos de Docker </w:t>
+      </w:r>
+      <w:proofErr w:type="spellStart"/>
+      <w:r>
+        <w:t>Compose</w:t>
+      </w:r>
+      <w:proofErr w:type="spellEnd"/>
+      <w:r>
+        <w:t>:</w:t>
+      </w:r>
+    </w:p>
+    <w:p/>
+    <w:p>
+      <w:pPr>
+        <w:pStyle w:val="Prrafodelista"/>
+        <w:numPr>
+          <w:ilvl w:val="0"/>
+          <w:numId w:val="1"/>
+        </w:numPr>
+      </w:pPr>
+      <w:r>
+        <w:t>P</w:t>
+      </w:r>
+      <w:r>
+        <w:t xml:space="preserve">olíticas de reinicio, implementada de forma transversal en los servicios </w:t>
+      </w:r>
+      <w:proofErr w:type="spellStart"/>
+      <w:r>
+        <w:t>core</w:t>
+      </w:r>
+      <w:proofErr w:type="spellEnd"/>
+      <w:r>
+        <w:t xml:space="preserve">, de IA y monitoreo. Si un </w:t>
+      </w:r>
+      <w:r>
+        <w:t>microservicio</w:t>
+      </w:r>
+      <w:r>
+        <w:t xml:space="preserve"> </w:t>
+      </w:r>
+      <w:r>
+        <w:t>experimenta</w:t>
+      </w:r>
+      <w:r>
+        <w:t xml:space="preserve"> un desborde de memoria, un fallo de segmentación o el servidor </w:t>
+      </w:r>
+      <w:r>
+        <w:t>físico</w:t>
+      </w:r>
+      <w:r>
+        <w:t xml:space="preserve"> se reinicia imprevistamente, el motor de Docker reanudará automáticamente el contenedor al </w:t>
+      </w:r>
+      <w:r>
+        <w:t>recuperar</w:t>
+      </w:r>
+      <w:r>
+        <w:t xml:space="preserve"> la estabilidad.</w:t>
+      </w:r>
+    </w:p>
+    <w:p>
+      <w:pPr>
+        <w:pStyle w:val="Prrafodelista"/>
+      </w:pPr>
+    </w:p>
+    <w:p>
+      <w:pPr>
+        <w:pStyle w:val="Prrafodelista"/>
+        <w:numPr>
+          <w:ilvl w:val="0"/>
+          <w:numId w:val="1"/>
+        </w:numPr>
+      </w:pPr>
+      <w:r>
+        <w:t>O</w:t>
+      </w:r>
+      <w:r>
+        <w:t xml:space="preserve">rquestación estricta de </w:t>
+      </w:r>
+      <w:r>
+        <w:t>arranque</w:t>
+      </w:r>
+      <w:r>
+        <w:t xml:space="preserve">, evita condiciones de carrera en el despliegue del sistema: el </w:t>
+      </w:r>
+      <w:proofErr w:type="spellStart"/>
+      <w:r>
+        <w:t>gateway</w:t>
+      </w:r>
+      <w:proofErr w:type="spellEnd"/>
+      <w:r>
+        <w:t xml:space="preserve"> no procesa web externo hasta que el </w:t>
+      </w:r>
+      <w:proofErr w:type="spellStart"/>
+      <w:r>
+        <w:t>frontend</w:t>
+      </w:r>
+      <w:proofErr w:type="spellEnd"/>
+      <w:r>
+        <w:t xml:space="preserve"> haya iniciado satisfactoriamente.</w:t>
+      </w:r>
+    </w:p>
+    <w:p>
+      <w:r>
+        <w:t xml:space="preserve">El </w:t>
+      </w:r>
+      <w:proofErr w:type="spellStart"/>
+      <w:r>
+        <w:t>prometheus</w:t>
+      </w:r>
+      <w:proofErr w:type="spellEnd"/>
+      <w:r>
+        <w:t xml:space="preserve"> posterga su ejecución hasta que el agente de métricas de bajo </w:t>
+      </w:r>
+      <w:r>
+        <w:t>nivel</w:t>
+      </w:r>
+      <w:r>
+        <w:t xml:space="preserve"> </w:t>
+      </w:r>
+      <w:proofErr w:type="spellStart"/>
+      <w:r>
+        <w:t>cadavisor</w:t>
+      </w:r>
+      <w:proofErr w:type="spellEnd"/>
+      <w:r>
+        <w:t xml:space="preserve"> esté operativo</w:t>
+      </w:r>
+    </w:p>
+    <w:p/>
+    <w:p>
+      <w:r>
+        <w:t xml:space="preserve">En cuanto a la IA se destaca el uso de </w:t>
+      </w:r>
+      <w:proofErr w:type="spellStart"/>
+      <w:r>
+        <w:t>healthcheck</w:t>
+      </w:r>
+      <w:proofErr w:type="spellEnd"/>
+      <w:r>
+        <w:t xml:space="preserve">, los </w:t>
+      </w:r>
+      <w:r>
+        <w:t>módulos</w:t>
+      </w:r>
+      <w:r>
+        <w:t xml:space="preserve"> que hacen uso de </w:t>
+      </w:r>
+      <w:proofErr w:type="spellStart"/>
+      <w:r>
+        <w:t>estan</w:t>
+      </w:r>
+      <w:proofErr w:type="spellEnd"/>
+      <w:r>
+        <w:t xml:space="preserve"> </w:t>
+      </w:r>
+      <w:proofErr w:type="spellStart"/>
+      <w:r>
+        <w:t>estan</w:t>
+      </w:r>
+      <w:proofErr w:type="spellEnd"/>
+      <w:r>
+        <w:t xml:space="preserve"> en </w:t>
+      </w:r>
+      <w:r>
+        <w:t>suspensión</w:t>
+      </w:r>
+      <w:r>
+        <w:t xml:space="preserve"> hasta que se pasen las pruebas exitosamente</w:t>
+      </w:r>
+    </w:p>
+    <w:p/>
+    <w:p/>
+    <w:p/>
+    <w:p/>
+    <w:p/>
+    <w:p/>
+    <w:p/>
+    <w:p/>
+    <w:p/>
+    <w:p/>
+    <w:p>
+      <w:pPr>
+        <w:jc w:val="center"/>
+        <w:rPr>
+          <w:sz w:val="28"/>
+          <w:szCs w:val="28"/>
+        </w:rPr>
+      </w:pPr>
+      <w:r>
+        <w:rPr>
+          <w:sz w:val="28"/>
+          <w:szCs w:val="28"/>
+        </w:rPr>
+        <w:lastRenderedPageBreak/>
+        <w:t>Gestión de Estado y Persistencia de Datos</w:t>
+      </w:r>
+    </w:p>
+    <w:p/>
+    <w:p>
+      <w:r>
+        <w:t xml:space="preserve">Para </w:t>
+      </w:r>
+      <w:r>
+        <w:t>evitar</w:t>
+      </w:r>
+      <w:r>
+        <w:t xml:space="preserve"> la naturaleza efímera de los contenedores y garantizar que la información delicada sobreviva a </w:t>
+      </w:r>
+      <w:r>
+        <w:t>actualizaciones</w:t>
+      </w:r>
+      <w:r>
+        <w:t xml:space="preserve"> de </w:t>
+      </w:r>
+      <w:r>
+        <w:t>imágenes</w:t>
+      </w:r>
+      <w:r>
+        <w:t xml:space="preserve"> o recreaciones de la infraestructura, se declaran volúmenes lógicos asignados al </w:t>
+      </w:r>
+      <w:proofErr w:type="gramStart"/>
+      <w:r>
+        <w:t>driver</w:t>
+      </w:r>
+      <w:proofErr w:type="gramEnd"/>
+      <w:r>
+        <w:t xml:space="preserve"> local:</w:t>
+      </w:r>
+    </w:p>
+    <w:p/>
+    <w:p>
+      <w:proofErr w:type="spellStart"/>
+      <w:r>
+        <w:t>Grafana_data</w:t>
+      </w:r>
+      <w:proofErr w:type="spellEnd"/>
+      <w:r>
+        <w:t xml:space="preserve">: almacena de forma persistente las </w:t>
+      </w:r>
+      <w:r>
+        <w:t>bases</w:t>
+      </w:r>
+      <w:r>
+        <w:t xml:space="preserve"> de datos internas de </w:t>
+      </w:r>
+      <w:proofErr w:type="spellStart"/>
+      <w:r>
+        <w:t>grafana</w:t>
+      </w:r>
+      <w:proofErr w:type="spellEnd"/>
+      <w:r>
+        <w:t xml:space="preserve">, resguardando usuarios, </w:t>
+      </w:r>
+      <w:r>
+        <w:t>configuraciones</w:t>
+      </w:r>
+      <w:r>
+        <w:t xml:space="preserve"> de </w:t>
+      </w:r>
+      <w:proofErr w:type="spellStart"/>
+      <w:r>
+        <w:t>dashboards</w:t>
+      </w:r>
+      <w:proofErr w:type="spellEnd"/>
+      <w:r>
+        <w:t xml:space="preserve"> personalizados y configuraciones de alertas.</w:t>
+      </w:r>
+    </w:p>
+    <w:p/>
+    <w:p>
+      <w:proofErr w:type="spellStart"/>
+      <w:r>
+        <w:t>Ollama_data</w:t>
+      </w:r>
+      <w:proofErr w:type="spellEnd"/>
+      <w:r>
+        <w:t xml:space="preserve">: volumen de alto impacto, ya que almacena los pesos binarios del modelo de lenguaje Llama3. Al persistir esta </w:t>
+      </w:r>
+      <w:r>
+        <w:t>estructura</w:t>
+      </w:r>
+      <w:r>
+        <w:t xml:space="preserve"> de gigabytes en el almacenamiento del host, se optimiza drásticamente el tiempo de despliegue en subsecuentes ejecuciones del comando </w:t>
+      </w:r>
+      <w:proofErr w:type="spellStart"/>
+      <w:r>
+        <w:t>docker</w:t>
+      </w:r>
+      <w:proofErr w:type="spellEnd"/>
+      <w:r>
+        <w:t xml:space="preserve"> </w:t>
+      </w:r>
+      <w:proofErr w:type="spellStart"/>
+      <w:r>
+        <w:t>compose</w:t>
+      </w:r>
+      <w:proofErr w:type="spellEnd"/>
+      <w:r>
+        <w:t xml:space="preserve"> up, evitando </w:t>
+      </w:r>
+      <w:proofErr w:type="spellStart"/>
+      <w:r>
+        <w:t>re-descargas</w:t>
+      </w:r>
+      <w:proofErr w:type="spellEnd"/>
+      <w:r>
+        <w:t xml:space="preserve"> innecesarias a través de la red</w:t>
+      </w:r>
+    </w:p>
+    <w:p/>
+    <w:p>
+      <w:pPr>
+        <w:jc w:val="center"/>
+        <w:rPr>
+          <w:sz w:val="28"/>
+          <w:szCs w:val="28"/>
+        </w:rPr>
+      </w:pPr>
+      <w:r>
+        <w:rPr>
+          <w:sz w:val="28"/>
+          <w:szCs w:val="28"/>
+        </w:rPr>
+        <w:t>Tecnologías</w:t>
+      </w:r>
+    </w:p>
+    <w:p/>
+    <w:p/>
+    <w:p>
+      <w:proofErr w:type="spellStart"/>
+      <w:r>
+        <w:t>Node</w:t>
+      </w:r>
+      <w:proofErr w:type="spellEnd"/>
+      <w:r>
+        <w:t xml:space="preserve"> y Express: motor para levantar el </w:t>
+      </w:r>
+      <w:proofErr w:type="spellStart"/>
+      <w:r>
+        <w:t>backend</w:t>
+      </w:r>
+      <w:proofErr w:type="spellEnd"/>
+      <w:r>
+        <w:t xml:space="preserve"> monolítico y microservicios independientes de forma asíncrona</w:t>
+      </w:r>
+    </w:p>
+    <w:p>
+      <w:r>
+        <w:t xml:space="preserve">Cors y </w:t>
+      </w:r>
+      <w:proofErr w:type="spellStart"/>
+      <w:r>
+        <w:t>Dotenv</w:t>
+      </w:r>
+      <w:proofErr w:type="spellEnd"/>
+      <w:r>
+        <w:t xml:space="preserve">: Manejo de políticas de origen cruzado para la comunicación segura con el </w:t>
+      </w:r>
+      <w:proofErr w:type="spellStart"/>
+      <w:r>
+        <w:t>frontend</w:t>
+      </w:r>
+      <w:proofErr w:type="spellEnd"/>
+      <w:r>
+        <w:t xml:space="preserve"> y gestión de variables de entorno para no exponer credenciales rígidas</w:t>
+      </w:r>
+    </w:p>
+    <w:p>
+      <w:r>
+        <w:t>Nodemailer: Módulo encargado del envío automatizado de correos electrónicos (</w:t>
+      </w:r>
+      <w:r>
+        <w:t>códigos</w:t>
+      </w:r>
+      <w:r>
+        <w:t xml:space="preserve"> 2FA)</w:t>
+      </w:r>
+    </w:p>
+    <w:p>
+      <w:proofErr w:type="spellStart"/>
+      <w:r>
+        <w:t>Node</w:t>
+      </w:r>
+      <w:proofErr w:type="spellEnd"/>
+      <w:r>
+        <w:t>-Cron: programador de tareas en segundo plano que gatilla el orquestador de notificaciones cada hora en punto</w:t>
+      </w:r>
+    </w:p>
+    <w:p>
+      <w:r>
+        <w:t>MySQL: motor relacional para la base de datos de profesionales y los pacientes</w:t>
+      </w:r>
+    </w:p>
+    <w:p/>
+    <w:p/>
+    <w:p>
+      <w:r>
+        <w:lastRenderedPageBreak/>
+        <w:t xml:space="preserve">Asterisk: emula una central </w:t>
+      </w:r>
+      <w:r>
+        <w:t>telefónica,</w:t>
+      </w:r>
+      <w:r>
+        <w:t xml:space="preserve"> </w:t>
+      </w:r>
+      <w:r>
+        <w:t>junto</w:t>
+      </w:r>
+      <w:r>
+        <w:t xml:space="preserve"> con </w:t>
+      </w:r>
+      <w:proofErr w:type="spellStart"/>
+      <w:r>
+        <w:t>pjsip</w:t>
+      </w:r>
+      <w:proofErr w:type="spellEnd"/>
+      <w:r>
+        <w:t xml:space="preserve"> (canal), se definen los </w:t>
+      </w:r>
+      <w:proofErr w:type="spellStart"/>
+      <w:r>
+        <w:t>endpoints</w:t>
+      </w:r>
+      <w:proofErr w:type="spellEnd"/>
+      <w:r>
+        <w:t xml:space="preserve"> de transporte </w:t>
+      </w:r>
+      <w:proofErr w:type="spellStart"/>
+      <w:r>
+        <w:t>udp</w:t>
+      </w:r>
+      <w:proofErr w:type="spellEnd"/>
+      <w:r>
+        <w:t xml:space="preserve"> con la autenticación segura de anexos y control de contactos simultáneos, junto con el RTP que es la configuración de los puertos </w:t>
+      </w:r>
+    </w:p>
+    <w:p>
+      <w:r>
+        <w:t xml:space="preserve">De las llamadas y el </w:t>
+      </w:r>
+      <w:proofErr w:type="spellStart"/>
+      <w:r>
+        <w:t>dialplan</w:t>
+      </w:r>
+      <w:proofErr w:type="spellEnd"/>
+      <w:r>
+        <w:t xml:space="preserve"> que es donde finalmente se procesan las llamadas y se captura el teclado del usuario</w:t>
+      </w:r>
+    </w:p>
+    <w:p>
+      <w:r>
+        <w:t>Ollama: Servidor local que expone modelos LLM de manera privada, configurado para usar Llama3.</w:t>
+      </w:r>
+    </w:p>
+    <w:p>
+      <w:proofErr w:type="spellStart"/>
+      <w:r>
+        <w:t>OpenAI</w:t>
+      </w:r>
+      <w:proofErr w:type="spellEnd"/>
+      <w:r>
+        <w:t xml:space="preserve">: utilizado dentro del servicio de chat dedicado para consumir la API compatible de Ollama mediante </w:t>
+      </w:r>
+      <w:proofErr w:type="spellStart"/>
+      <w:r>
+        <w:t>endspoint</w:t>
+      </w:r>
+      <w:r>
+        <w:t>s</w:t>
+      </w:r>
+      <w:proofErr w:type="spellEnd"/>
+      <w:r>
+        <w:t>.</w:t>
+      </w:r>
+    </w:p>
+    <w:p>
+      <w:proofErr w:type="spellStart"/>
+      <w:r>
+        <w:t>Nginx</w:t>
+      </w:r>
+      <w:proofErr w:type="spellEnd"/>
+      <w:r>
+        <w:t xml:space="preserve">: configurado como proxy inverso y una puerta de enlace centralizada para enrutar el tráfico de </w:t>
+      </w:r>
+      <w:proofErr w:type="gramStart"/>
+      <w:r>
+        <w:t>red ,</w:t>
+      </w:r>
+      <w:proofErr w:type="gramEnd"/>
+      <w:r>
+        <w:t xml:space="preserve"> </w:t>
+      </w:r>
+      <w:r>
+        <w:t>exponiendo</w:t>
+      </w:r>
+      <w:r>
+        <w:t xml:space="preserve"> puertos </w:t>
+      </w:r>
+      <w:r>
+        <w:t>estándar</w:t>
+      </w:r>
+      <w:r>
+        <w:t xml:space="preserve"> en incorporando </w:t>
+      </w:r>
+      <w:r>
+        <w:t>directivas</w:t>
+      </w:r>
+      <w:r>
+        <w:t xml:space="preserve"> de </w:t>
+      </w:r>
+      <w:proofErr w:type="spellStart"/>
+      <w:r>
+        <w:t>healthcheck</w:t>
+      </w:r>
+      <w:proofErr w:type="spellEnd"/>
+      <w:r>
+        <w:t xml:space="preserve"> nativas para verificar la salud del contenedor a intervalos de 30 segundos mediante </w:t>
+      </w:r>
+      <w:proofErr w:type="spellStart"/>
+      <w:r>
+        <w:t>curl</w:t>
+      </w:r>
+      <w:proofErr w:type="spellEnd"/>
+      <w:r>
+        <w:t>.</w:t>
+      </w:r>
+    </w:p>
+    <w:p/>
+    <w:p>
+      <w:r>
+        <w:t xml:space="preserve">Bash scripting: automatiza la sincronización inicial del clúster extrayendo la posición </w:t>
+      </w:r>
+      <w:r>
+        <w:t>e</w:t>
+      </w:r>
+      <w:r>
+        <w:t xml:space="preserve">xacta del </w:t>
+      </w:r>
+      <w:proofErr w:type="gramStart"/>
+      <w:r>
+        <w:t>master</w:t>
+      </w:r>
+      <w:proofErr w:type="gramEnd"/>
+      <w:r>
+        <w:t xml:space="preserve"> con </w:t>
+      </w:r>
+      <w:proofErr w:type="spellStart"/>
+      <w:r>
+        <w:t>awk</w:t>
+      </w:r>
+      <w:proofErr w:type="spellEnd"/>
+      <w:r>
+        <w:t xml:space="preserve"> y apunta la réplica mediante </w:t>
+      </w:r>
+      <w:proofErr w:type="spellStart"/>
+      <w:r>
+        <w:t>change</w:t>
+      </w:r>
+      <w:proofErr w:type="spellEnd"/>
+      <w:r>
+        <w:t xml:space="preserve"> </w:t>
+      </w:r>
+      <w:proofErr w:type="spellStart"/>
+      <w:r>
+        <w:t>replication</w:t>
+      </w:r>
+      <w:proofErr w:type="spellEnd"/>
+      <w:r>
+        <w:t xml:space="preserve"> </w:t>
+      </w:r>
+      <w:proofErr w:type="spellStart"/>
+      <w:r>
+        <w:t>source</w:t>
+      </w:r>
+      <w:proofErr w:type="spellEnd"/>
+      <w:r>
+        <w:t xml:space="preserve"> </w:t>
+      </w:r>
+      <w:proofErr w:type="spellStart"/>
+      <w:r>
+        <w:t>to</w:t>
+      </w:r>
+      <w:proofErr w:type="spellEnd"/>
+      <w:r>
+        <w:t>.</w:t>
+      </w:r>
+    </w:p>
+    <w:p>
+      <w:r>
+        <w:t xml:space="preserve">Prometheus: sistema de monitoreo por </w:t>
+      </w:r>
+      <w:proofErr w:type="spellStart"/>
+      <w:r>
+        <w:t>scraping</w:t>
+      </w:r>
+      <w:proofErr w:type="spellEnd"/>
+      <w:r>
+        <w:t xml:space="preserve"> configurado para recolectar métricas </w:t>
+      </w:r>
+      <w:r>
+        <w:t>operacionales</w:t>
+      </w:r>
+      <w:r>
+        <w:t xml:space="preserve"> del sistema cada 15 segundos</w:t>
+      </w:r>
+    </w:p>
+    <w:p/>
+    <w:p>
+      <w:proofErr w:type="spellStart"/>
+      <w:r>
+        <w:t>Cadvisor</w:t>
+      </w:r>
+      <w:proofErr w:type="spellEnd"/>
+      <w:r>
+        <w:t xml:space="preserve">: herramienta de </w:t>
+      </w:r>
+      <w:r>
+        <w:t>Google</w:t>
+      </w:r>
+      <w:r>
+        <w:t xml:space="preserve"> integrada en </w:t>
+      </w:r>
+      <w:proofErr w:type="spellStart"/>
+      <w:r>
+        <w:t>rl</w:t>
+      </w:r>
+      <w:proofErr w:type="spellEnd"/>
+      <w:r>
+        <w:t xml:space="preserve"> mapa de </w:t>
+      </w:r>
+      <w:proofErr w:type="spellStart"/>
+      <w:r>
+        <w:t>prometheus</w:t>
+      </w:r>
+      <w:proofErr w:type="spellEnd"/>
+      <w:r>
+        <w:t xml:space="preserve"> para auditar en tiempo real el consumo de CPU, memoria y red de cada </w:t>
+      </w:r>
+      <w:r>
+        <w:t>contenedor</w:t>
+      </w:r>
+      <w:r>
+        <w:t xml:space="preserve"> de la arquitectura</w:t>
+      </w:r>
+      <w:r>
+        <w:t>.</w:t>
+      </w:r>
+    </w:p>
+    <w:p/>
+    <w:p>
+      <w:pPr>
+        <w:jc w:val="center"/>
+        <w:rPr>
+          <w:sz w:val="28"/>
+          <w:szCs w:val="28"/>
+        </w:rPr>
+      </w:pPr>
+      <w:r>
+        <w:rPr>
+          <w:sz w:val="28"/>
+          <w:szCs w:val="28"/>
+        </w:rPr>
+        <w:t>Procedimiento de despliegue</w:t>
+      </w:r>
+    </w:p>
+    <w:p/>
+    <w:p>
+      <w:r>
+        <w:t xml:space="preserve">Esta todo automatizado, </w:t>
+      </w:r>
+      <w:r>
+        <w:t xml:space="preserve">no es necesario instalar nada externo (además de Docker, que lo obviamos), </w:t>
+      </w:r>
+      <w:r>
+        <w:t xml:space="preserve">en cuanto a ejecución desde la VM está completamente compatible, si llevamos esto a un dispositivo </w:t>
+      </w:r>
+      <w:r>
+        <w:t>físico,</w:t>
+      </w:r>
+      <w:r>
+        <w:t xml:space="preserve"> consideramos </w:t>
+      </w:r>
+      <w:proofErr w:type="gramStart"/>
+      <w:r>
+        <w:t>de que</w:t>
+      </w:r>
+      <w:proofErr w:type="gramEnd"/>
+      <w:r>
+        <w:t xml:space="preserve"> podrían fallar ciertas cosas.</w:t>
+      </w:r>
+    </w:p>
+    <w:p/>
+    <w:p/>
+    <w:p>
+      <w:pPr>
+        <w:jc w:val="center"/>
+        <w:rPr>
+          <w:sz w:val="28"/>
+          <w:szCs w:val="28"/>
+        </w:rPr>
+      </w:pPr>
+      <w:r>
+        <w:rPr>
+          <w:sz w:val="28"/>
+          <w:szCs w:val="28"/>
+        </w:rPr>
+        <w:lastRenderedPageBreak/>
+        <w:t>Diagrama</w:t>
+      </w:r>
+    </w:p>
+    <w:p>
+      <w:pPr>
+        <w:rPr>
+          <w:sz w:val="28"/>
+          <w:szCs w:val="28"/>
+          <w:u w:val="single"/>
+        </w:rPr>
+      </w:pPr>
+    </w:p>
+    <w:p>
+      <w:pPr>
+        <w:rPr>
+          <w:sz w:val="28"/>
+          <w:szCs w:val="28"/>
+        </w:rPr>
+      </w:pPr>
     </w:p>
     <w:p/>
     <w:p/>
@@ -141,6 +1334,126 @@
     </w:sectPr>
   </w:body>
 </w:document>
+</file>
+
+<file path=word/numbering.xml><?xml version="1.0" encoding="utf-8"?>
+<w:numbering xmlns:wpc="http://schemas.microsoft.com/office/word/2010/wordprocessingCanvas" xmlns:cx="http://schemas.microsoft.com/office/drawing/2014/chartex" xmlns:cx1="http://schemas.microsoft.com/office/drawing/2015/9/8/chartex" xmlns:cx2="http://schemas.microsoft.com/office/drawing/2015/10/21/chartex" xmlns:cx3="http://schemas.microsoft.com/office/drawing/2016/5/9/chartex" xmlns:cx4="http://schemas.microsoft.com/office/drawing/2016/5/10/chartex" xmlns:cx5="http://schemas.microsoft.com/office/drawing/2016/5/11/chartex" xmlns:cx6="http://schemas.microsoft.com/office/drawing/2016/5/12/chartex" xmlns:cx7="http://schemas.microsoft.com/office/drawing/2016/5/13/chartex" xmlns:cx8="http://schemas.microsoft.com/office/drawing/2016/5/14/chartex" xmlns:mc="http://schemas.openxmlformats.org/markup-compatibility/2006" xmlns:aink="http://schemas.microsoft.com/office/drawing/2016/ink" xmlns:am3d="http://schemas.microsoft.com/office/drawing/2017/model3d" xmlns:o="urn:schemas-microsoft-com:office:office" xmlns:oel="http://schemas.microsoft.com/office/2019/extlst" xmlns:r="http://schemas.openxmlformats.org/officeDocument/2006/relationships" xmlns:m="http://schemas.openxmlformats.org/officeDocument/2006/math" xmlns:v="urn:schemas-microsoft-com:vml" xmlns:wp14="http://schemas.microsoft.com/office/word/2010/wordprocessingDrawing" xmlns:wp="http://schemas.openxmlformats.org/drawingml/2006/wordprocessingDrawing" xmlns:w10="urn:schemas-microsoft-com:office:word" xmlns:w="http://schemas.openxmlformats.org/wordprocessingml/2006/main" xmlns:w14="http://schemas.microsoft.com/office/word/2010/wordml" xmlns:w15="http://schemas.microsoft.com/office/word/2012/wordml" xmlns:w16cex="http://schemas.microsoft.com/office/word/2018/wordml/cex" xmlns:w16cid="http://schemas.microsoft.com/office/word/2016/wordml/cid" xmlns:w16="http://schemas.microsoft.com/office/word/2018/wordml" xmlns:w16du="http://schemas.microsoft.com/office/word/2023/wordml/word16du" xmlns:w16sdtdh="http://schemas.microsoft.com/office/word/2020/wordml/sdtdatahash" xmlns:w16sdtfl="http://schemas.microsoft.com/office/word/2024/wordml/sdtformatlock" xmlns:w16se="http://schemas.microsoft.com/office/word/2015/wordml/symex" xmlns:wpg="http://schemas.microsoft.com/office/word/2010/wordprocessingGroup" xmlns:wpi="http://schemas.microsoft.com/office/word/2010/wordprocessingInk" xmlns:wne="http://schemas.microsoft.com/office/word/2006/wordml" xmlns:wps="http://schemas.microsoft.com/office/word/2010/wordprocessingShape" mc:Ignorable="w14 w15 w16se w16cid w16 w16cex w16sdtdh w16sdtfl w16du wp14">
+  <w:abstractNum w:abstractNumId="0" w15:restartNumberingAfterBreak="0">
+    <w:nsid w:val="021A4487"/>
+    <w:multiLevelType w:val="hybridMultilevel"/>
+    <w:tmpl w:val="DC541032"/>
+    <w:lvl w:ilvl="0" w:tplc="7598DCBC">
+      <w:numFmt w:val="bullet"/>
+      <w:lvlText w:val="-"/>
+      <w:lvlJc w:val="left"/>
+      <w:pPr>
+        <w:ind w:left="720" w:hanging="360"/>
+      </w:pPr>
+      <w:rPr>
+        <w:rFonts w:ascii="Aptos" w:eastAsiaTheme="minorHAnsi" w:hAnsi="Aptos" w:cstheme="minorBidi" w:hint="default"/>
+      </w:rPr>
+    </w:lvl>
+    <w:lvl w:ilvl="1" w:tplc="340A0003" w:tentative="1">
+      <w:start w:val="1"/>
+      <w:numFmt w:val="bullet"/>
+      <w:lvlText w:val="o"/>
+      <w:lvlJc w:val="left"/>
+      <w:pPr>
+        <w:ind w:left="1440" w:hanging="360"/>
+      </w:pPr>
+      <w:rPr>
+        <w:rFonts w:ascii="Courier New" w:hAnsi="Courier New" w:cs="Courier New" w:hint="default"/>
+      </w:rPr>
+    </w:lvl>
+    <w:lvl w:ilvl="2" w:tplc="340A0005" w:tentative="1">
+      <w:start w:val="1"/>
+      <w:numFmt w:val="bullet"/>
+      <w:lvlText w:val=""/>
+      <w:lvlJc w:val="left"/>
+      <w:pPr>
+        <w:ind w:left="2160" w:hanging="360"/>
+      </w:pPr>
+      <w:rPr>
+        <w:rFonts w:ascii="Wingdings" w:hAnsi="Wingdings" w:hint="default"/>
+      </w:rPr>
+    </w:lvl>
+    <w:lvl w:ilvl="3" w:tplc="340A0001" w:tentative="1">
+      <w:start w:val="1"/>
+      <w:numFmt w:val="bullet"/>
+      <w:lvlText w:val=""/>
+      <w:lvlJc w:val="left"/>
+      <w:pPr>
+        <w:ind w:left="2880" w:hanging="360"/>
+      </w:pPr>
+      <w:rPr>
+        <w:rFonts w:ascii="Symbol" w:hAnsi="Symbol" w:hint="default"/>
+      </w:rPr>
+    </w:lvl>
+    <w:lvl w:ilvl="4" w:tplc="340A0003" w:tentative="1">
+      <w:start w:val="1"/>
+      <w:numFmt w:val="bullet"/>
+      <w:lvlText w:val="o"/>
+      <w:lvlJc w:val="left"/>
+      <w:pPr>
+        <w:ind w:left="3600" w:hanging="360"/>
+      </w:pPr>
+      <w:rPr>
+        <w:rFonts w:ascii="Courier New" w:hAnsi="Courier New" w:cs="Courier New" w:hint="default"/>
+      </w:rPr>
+    </w:lvl>
+    <w:lvl w:ilvl="5" w:tplc="340A0005" w:tentative="1">
+      <w:start w:val="1"/>
+      <w:numFmt w:val="bullet"/>
+      <w:lvlText w:val=""/>
+      <w:lvlJc w:val="left"/>
+      <w:pPr>
+        <w:ind w:left="4320" w:hanging="360"/>
+      </w:pPr>
+      <w:rPr>
+        <w:rFonts w:ascii="Wingdings" w:hAnsi="Wingdings" w:hint="default"/>
+      </w:rPr>
+    </w:lvl>
+    <w:lvl w:ilvl="6" w:tplc="340A0001" w:tentative="1">
+      <w:start w:val="1"/>
+      <w:numFmt w:val="bullet"/>
+      <w:lvlText w:val=""/>
+      <w:lvlJc w:val="left"/>
+      <w:pPr>
+        <w:ind w:left="5040" w:hanging="360"/>
+      </w:pPr>
+      <w:rPr>
+        <w:rFonts w:ascii="Symbol" w:hAnsi="Symbol" w:hint="default"/>
+      </w:rPr>
+    </w:lvl>
+    <w:lvl w:ilvl="7" w:tplc="340A0003" w:tentative="1">
+      <w:start w:val="1"/>
+      <w:numFmt w:val="bullet"/>
+      <w:lvlText w:val="o"/>
+      <w:lvlJc w:val="left"/>
+      <w:pPr>
+        <w:ind w:left="5760" w:hanging="360"/>
+      </w:pPr>
+      <w:rPr>
+        <w:rFonts w:ascii="Courier New" w:hAnsi="Courier New" w:cs="Courier New" w:hint="default"/>
+      </w:rPr>
+    </w:lvl>
+    <w:lvl w:ilvl="8" w:tplc="340A0005" w:tentative="1">
+      <w:start w:val="1"/>
+      <w:numFmt w:val="bullet"/>
+      <w:lvlText w:val=""/>
+      <w:lvlJc w:val="left"/>
+      <w:pPr>
+        <w:ind w:left="6480" w:hanging="360"/>
+      </w:pPr>
+      <w:rPr>
+        <w:rFonts w:ascii="Wingdings" w:hAnsi="Wingdings" w:hint="default"/>
+      </w:rPr>
+    </w:lvl>
+  </w:abstractNum>
+  <w:num w:numId="1" w16cid:durableId="1444418271">
+    <w:abstractNumId w:val="0"/>
+  </w:num>
+</w:numbering>
 </file>
 
 <file path=word/styles.xml><?xml version="1.0" encoding="utf-8"?>
@@ -746,6 +2059,7 @@
   <w:style w:type="character" w:default="1" w:styleId="Fuentedeprrafopredeter">
     <w:name w:val="Default Paragraph Font"/>
     <w:uiPriority w:val="1"/>
+    <w:semiHidden/>
     <w:unhideWhenUsed/>
   </w:style>
   <w:style w:type="table" w:default="1" w:styleId="Tablanormal">
@@ -1375,4 +2689,227 @@
     </a:ext>
   </a:extLst>
 </a:theme>
+</file>
+
+<file path=customXml/item1.xml><?xml version="1.0" encoding="utf-8"?>
+<ct:contentTypeSchema xmlns:ct="http://schemas.microsoft.com/office/2006/metadata/contentType" xmlns:ma="http://schemas.microsoft.com/office/2006/metadata/properties/metaAttributes" ct:_="" ma:_="" ma:contentTypeName="Document" ma:contentTypeID="0x0101005BACECDBED1505488D1A9300EF347818" ma:contentTypeVersion="8" ma:contentTypeDescription="Create a new document." ma:contentTypeScope="" ma:versionID="6dbd9ec4bdb4c6634655e9a82b0e7a50">
+  <xsd:schema xmlns:xsd="http://www.w3.org/2001/XMLSchema" xmlns:xs="http://www.w3.org/2001/XMLSchema" xmlns:p="http://schemas.microsoft.com/office/2006/metadata/properties" xmlns:ns3="2cf6b789-eaf6-4745-8ca2-4700afb459ae" targetNamespace="http://schemas.microsoft.com/office/2006/metadata/properties" ma:root="true" ma:fieldsID="be91f182f2b5d0cdd5f71db1e6123610" ns3:_="">
+    <xsd:import namespace="2cf6b789-eaf6-4745-8ca2-4700afb459ae"/>
+    <xsd:element name="properties">
+      <xsd:complexType>
+        <xsd:sequence>
+          <xsd:element name="documentManagement">
+            <xsd:complexType>
+              <xsd:all>
+                <xsd:element ref="ns3:MediaServiceMetadata" minOccurs="0"/>
+                <xsd:element ref="ns3:MediaServiceFastMetadata" minOccurs="0"/>
+                <xsd:element ref="ns3:MediaServiceAutoKeyPoints" minOccurs="0"/>
+                <xsd:element ref="ns3:MediaServiceKeyPoints" minOccurs="0"/>
+                <xsd:element ref="ns3:_activity" minOccurs="0"/>
+                <xsd:element ref="ns3:MediaServiceObjectDetectorVersions" minOccurs="0"/>
+                <xsd:element ref="ns3:MediaServiceSearchProperties" minOccurs="0"/>
+                <xsd:element ref="ns3:MediaServiceDateTaken" minOccurs="0"/>
+              </xsd:all>
+            </xsd:complexType>
+          </xsd:element>
+        </xsd:sequence>
+      </xsd:complexType>
+    </xsd:element>
+  </xsd:schema>
+  <xsd:schema xmlns:xsd="http://www.w3.org/2001/XMLSchema" xmlns:xs="http://www.w3.org/2001/XMLSchema" xmlns:dms="http://schemas.microsoft.com/office/2006/documentManagement/types" xmlns:pc="http://schemas.microsoft.com/office/infopath/2007/PartnerControls" targetNamespace="2cf6b789-eaf6-4745-8ca2-4700afb459ae" elementFormDefault="qualified">
+    <xsd:import namespace="http://schemas.microsoft.com/office/2006/documentManagement/types"/>
+    <xsd:import namespace="http://schemas.microsoft.com/office/infopath/2007/PartnerControls"/>
+    <xsd:element name="MediaServiceMetadata" ma:index="8" nillable="true" ma:displayName="MediaServiceMetadata" ma:hidden="true" ma:internalName="MediaServiceMetadata" ma:readOnly="true">
+      <xsd:simpleType>
+        <xsd:restriction base="dms:Note"/>
+      </xsd:simpleType>
+    </xsd:element>
+    <xsd:element name="MediaServiceFastMetadata" ma:index="9" nillable="true" ma:displayName="MediaServiceFastMetadata" ma:hidden="true" ma:internalName="MediaServiceFastMetadata" ma:readOnly="true">
+      <xsd:simpleType>
+        <xsd:restriction base="dms:Note"/>
+      </xsd:simpleType>
+    </xsd:element>
+    <xsd:element name="MediaServiceAutoKeyPoints" ma:index="10" nillable="true" ma:displayName="MediaServiceAutoKeyPoints" ma:hidden="true" ma:internalName="MediaServiceAutoKeyPoints" ma:readOnly="true">
+      <xsd:simpleType>
+        <xsd:restriction base="dms:Note"/>
+      </xsd:simpleType>
+    </xsd:element>
+    <xsd:element name="MediaServiceKeyPoints" ma:index="11" nillable="true" ma:displayName="KeyPoints" ma:internalName="MediaServiceKeyPoints" ma:readOnly="true">
+      <xsd:simpleType>
+        <xsd:restriction base="dms:Note">
+          <xsd:maxLength value="255"/>
+        </xsd:restriction>
+      </xsd:simpleType>
+    </xsd:element>
+    <xsd:element name="_activity" ma:index="12" nillable="true" ma:displayName="_activity" ma:hidden="true" ma:internalName="_activity">
+      <xsd:simpleType>
+        <xsd:restriction base="dms:Note"/>
+      </xsd:simpleType>
+    </xsd:element>
+    <xsd:element name="MediaServiceObjectDetectorVersions" ma:index="13" nillable="true" ma:displayName="MediaServiceObjectDetectorVersions" ma:hidden="true" ma:indexed="true" ma:internalName="MediaServiceObjectDetectorVersions" ma:readOnly="true">
+      <xsd:simpleType>
+        <xsd:restriction base="dms:Text"/>
+      </xsd:simpleType>
+    </xsd:element>
+    <xsd:element name="MediaServiceSearchProperties" ma:index="14" nillable="true" ma:displayName="MediaServiceSearchProperties" ma:hidden="true" ma:internalName="MediaServiceSearchProperties" ma:readOnly="true">
+      <xsd:simpleType>
+        <xsd:restriction base="dms:Note"/>
+      </xsd:simpleType>
+    </xsd:element>
+    <xsd:element name="MediaServiceDateTaken" ma:index="15" nillable="true" ma:displayName="MediaServiceDateTaken" ma:hidden="true" ma:indexed="true" ma:internalName="MediaServiceDateTaken" ma:readOnly="true">
+      <xsd:simpleType>
+        <xsd:restriction base="dms:Text"/>
+      </xsd:simpleType>
+    </xsd:element>
+  </xsd:schema>
+  <xsd:schema xmlns="http://schemas.openxmlformats.org/package/2006/metadata/core-properties" xmlns:xsd="http://www.w3.org/2001/XMLSchema" xmlns:xsi="http://www.w3.org/2001/XMLSchema-instance" xmlns:dc="http://purl.org/dc/elements/1.1/" xmlns:dcterms="http://purl.org/dc/terms/" xmlns:odoc="http://schemas.microsoft.com/internal/obd" targetNamespace="http://schemas.openxmlformats.org/package/2006/metadata/core-properties" elementFormDefault="qualified" attributeFormDefault="unqualified" blockDefault="#all">
+    <xsd:import namespace="http://purl.org/dc/elements/1.1/" schemaLocation="http://dublincore.org/schemas/xmls/qdc/2003/04/02/dc.xsd"/>
+    <xsd:import namespace="http://purl.org/dc/terms/" schemaLocation="http://dublincore.org/schemas/xmls/qdc/2003/04/02/dcterms.xsd"/>
+    <xsd:element name="coreProperties" type="CT_coreProperties"/>
+    <xsd:complexType name="CT_coreProperties">
+      <xsd:all>
+        <xsd:element ref="dc:creator" minOccurs="0" maxOccurs="1"/>
+        <xsd:element ref="dcterms:created" minOccurs="0" maxOccurs="1"/>
+        <xsd:element ref="dc:identifier" minOccurs="0" maxOccurs="1"/>
+        <xsd:element name="contentType" minOccurs="0" maxOccurs="1" type="xsd:string" ma:index="0" ma:displayName="Content Type"/>
+        <xsd:element ref="dc:title" minOccurs="0" maxOccurs="1" ma:index="4" ma:displayName="Title"/>
+        <xsd:element ref="dc:subject" minOccurs="0" maxOccurs="1"/>
+        <xsd:element ref="dc:description" minOccurs="0" maxOccurs="1"/>
+        <xsd:element name="keywords" minOccurs="0" maxOccurs="1" type="xsd:string"/>
+        <xsd:element ref="dc:language" minOccurs="0" maxOccurs="1"/>
+        <xsd:element name="category" minOccurs="0" maxOccurs="1" type="xsd:string"/>
+        <xsd:element name="version" minOccurs="0" maxOccurs="1" type="xsd:string"/>
+        <xsd:element name="revision" minOccurs="0" maxOccurs="1" type="xsd:string">
+          <xsd:annotation>
+            <xsd:documentation>
+                        This value indicates the number of saves or revisions. The application is responsible for updating this value after each revision.
+                    </xsd:documentation>
+          </xsd:annotation>
+        </xsd:element>
+        <xsd:element name="lastModifiedBy" minOccurs="0" maxOccurs="1" type="xsd:string"/>
+        <xsd:element ref="dcterms:modified" minOccurs="0" maxOccurs="1"/>
+        <xsd:element name="contentStatus" minOccurs="0" maxOccurs="1" type="xsd:string"/>
+      </xsd:all>
+    </xsd:complexType>
+  </xsd:schema>
+  <xs:schema xmlns:pc="http://schemas.microsoft.com/office/infopath/2007/PartnerControls" xmlns:xs="http://www.w3.org/2001/XMLSchema" targetNamespace="http://schemas.microsoft.com/office/infopath/2007/PartnerControls" elementFormDefault="qualified" attributeFormDefault="unqualified">
+    <xs:element name="Person">
+      <xs:complexType>
+        <xs:sequence>
+          <xs:element ref="pc:DisplayName" minOccurs="0"/>
+          <xs:element ref="pc:AccountId" minOccurs="0"/>
+          <xs:element ref="pc:AccountType" minOccurs="0"/>
+        </xs:sequence>
+      </xs:complexType>
+    </xs:element>
+    <xs:element name="DisplayName" type="xs:string"/>
+    <xs:element name="AccountId" type="xs:string"/>
+    <xs:element name="AccountType" type="xs:string"/>
+    <xs:element name="BDCAssociatedEntity">
+      <xs:complexType>
+        <xs:sequence>
+          <xs:element ref="pc:BDCEntity" minOccurs="0" maxOccurs="unbounded"/>
+        </xs:sequence>
+        <xs:attribute ref="pc:EntityNamespace"/>
+        <xs:attribute ref="pc:EntityName"/>
+        <xs:attribute ref="pc:SystemInstanceName"/>
+        <xs:attribute ref="pc:AssociationName"/>
+      </xs:complexType>
+    </xs:element>
+    <xs:attribute name="EntityNamespace" type="xs:string"/>
+    <xs:attribute name="EntityName" type="xs:string"/>
+    <xs:attribute name="SystemInstanceName" type="xs:string"/>
+    <xs:attribute name="AssociationName" type="xs:string"/>
+    <xs:element name="BDCEntity">
+      <xs:complexType>
+        <xs:sequence>
+          <xs:element ref="pc:EntityDisplayName" minOccurs="0"/>
+          <xs:element ref="pc:EntityInstanceReference" minOccurs="0"/>
+          <xs:element ref="pc:EntityId1" minOccurs="0"/>
+          <xs:element ref="pc:EntityId2" minOccurs="0"/>
+          <xs:element ref="pc:EntityId3" minOccurs="0"/>
+          <xs:element ref="pc:EntityId4" minOccurs="0"/>
+          <xs:element ref="pc:EntityId5" minOccurs="0"/>
+        </xs:sequence>
+      </xs:complexType>
+    </xs:element>
+    <xs:element name="EntityDisplayName" type="xs:string"/>
+    <xs:element name="EntityInstanceReference" type="xs:string"/>
+    <xs:element name="EntityId1" type="xs:string"/>
+    <xs:element name="EntityId2" type="xs:string"/>
+    <xs:element name="EntityId3" type="xs:string"/>
+    <xs:element name="EntityId4" type="xs:string"/>
+    <xs:element name="EntityId5" type="xs:string"/>
+    <xs:element name="Terms">
+      <xs:complexType>
+        <xs:sequence>
+          <xs:element ref="pc:TermInfo" minOccurs="0" maxOccurs="unbounded"/>
+        </xs:sequence>
+      </xs:complexType>
+    </xs:element>
+    <xs:element name="TermInfo">
+      <xs:complexType>
+        <xs:sequence>
+          <xs:element ref="pc:TermName" minOccurs="0"/>
+          <xs:element ref="pc:TermId" minOccurs="0"/>
+        </xs:sequence>
+      </xs:complexType>
+    </xs:element>
+    <xs:element name="TermName" type="xs:string"/>
+    <xs:element name="TermId" type="xs:string"/>
+  </xs:schema>
+</ct:contentTypeSchema>
+</file>
+
+<file path=customXml/item2.xml><?xml version="1.0" encoding="utf-8"?>
+<?mso-contentType ?>
+<FormTemplates xmlns="http://schemas.microsoft.com/sharepoint/v3/contenttype/forms">
+  <Display>DocumentLibraryForm</Display>
+  <Edit>DocumentLibraryForm</Edit>
+  <New>DocumentLibraryForm</New>
+</FormTemplates>
+</file>
+
+<file path=customXml/item3.xml><?xml version="1.0" encoding="utf-8"?>
+<p:properties xmlns:p="http://schemas.microsoft.com/office/2006/metadata/properties" xmlns:xsi="http://www.w3.org/2001/XMLSchema-instance" xmlns:pc="http://schemas.microsoft.com/office/infopath/2007/PartnerControls">
+  <documentManagement>
+    <_activity xmlns="2cf6b789-eaf6-4745-8ca2-4700afb459ae" xsi:nil="true"/>
+  </documentManagement>
+</p:properties>
+</file>
+
+<file path=customXml/itemProps1.xml><?xml version="1.0" encoding="utf-8"?>
+<ds:datastoreItem xmlns:ds="http://schemas.openxmlformats.org/officeDocument/2006/customXml" ds:itemID="{56AB95BE-92B8-4481-A300-1FB170EC86F6}">
+  <ds:schemaRefs>
+    <ds:schemaRef ds:uri="http://schemas.microsoft.com/office/2006/metadata/contentType"/>
+    <ds:schemaRef ds:uri="http://schemas.microsoft.com/office/2006/metadata/properties/metaAttributes"/>
+    <ds:schemaRef ds:uri="http://www.w3.org/2001/XMLSchema"/>
+    <ds:schemaRef ds:uri="http://schemas.microsoft.com/office/2006/metadata/properties"/>
+    <ds:schemaRef ds:uri="2cf6b789-eaf6-4745-8ca2-4700afb459ae"/>
+    <ds:schemaRef ds:uri="http://schemas.microsoft.com/office/2006/documentManagement/types"/>
+    <ds:schemaRef ds:uri="http://schemas.microsoft.com/office/infopath/2007/PartnerControls"/>
+    <ds:schemaRef ds:uri="http://schemas.openxmlformats.org/package/2006/metadata/core-properties"/>
+    <ds:schemaRef ds:uri="http://purl.org/dc/elements/1.1/"/>
+    <ds:schemaRef ds:uri="http://purl.org/dc/terms/"/>
+    <ds:schemaRef ds:uri="http://schemas.microsoft.com/internal/obd"/>
+  </ds:schemaRefs>
+</ds:datastoreItem>
+</file>
+
+<file path=customXml/itemProps2.xml><?xml version="1.0" encoding="utf-8"?>
+<ds:datastoreItem xmlns:ds="http://schemas.openxmlformats.org/officeDocument/2006/customXml" ds:itemID="{B3FD5E0C-BA87-4A11-9999-7B82B15BFF5A}">
+  <ds:schemaRefs>
+    <ds:schemaRef ds:uri="http://schemas.microsoft.com/sharepoint/v3/contenttype/forms"/>
+  </ds:schemaRefs>
+</ds:datastoreItem>
+</file>
+
+<file path=customXml/itemProps3.xml><?xml version="1.0" encoding="utf-8"?>
+<ds:datastoreItem xmlns:ds="http://schemas.openxmlformats.org/officeDocument/2006/customXml" ds:itemID="{4ADC7B10-6B5F-4171-9EE9-D3B1F203D7D2}">
+  <ds:schemaRefs>
+    <ds:schemaRef ds:uri="http://schemas.microsoft.com/office/2006/metadata/properties"/>
+    <ds:schemaRef ds:uri="http://schemas.microsoft.com/office/infopath/2007/PartnerControls"/>
+    <ds:schemaRef ds:uri="2cf6b789-eaf6-4745-8ca2-4700afb459ae"/>
+  </ds:schemaRefs>
+</ds:datastoreItem>
 </file>
</xml_diff>